<commit_message>
feat: UI improvements and form fixes
- Refactored DailyReportFormTab dropdowns with integrated search and PC icons
- Fixed lab data retrieval in CITLabUsersForm and SoftwareInstallForm
- Enhanced CORS configuration for development environment
- Removed Lost status from custodian analytics dashboard
- Added SearchableSelect component for consistent UI
- Improved form validation and error handling
- Enhanced security for complaint management endpoints
- Removed default Vite styles causing whitespace issues
</commit_message>
<xml_diff>
--- a/frontend/public/Lab1_DAR.docx
+++ b/frontend/public/Lab1_DAR.docx
@@ -2899,8 +2899,6 @@
         </w:rPr>
         <w:t>}</w:t>
       </w:r>
-      <w:bookmarkStart w:id="0" w:name="_GoBack"/>
-      <w:bookmarkEnd w:id="0"/>
     </w:p>
     <w:p>
       <w:pPr>
@@ -3095,6 +3093,7 @@
           </w:tcPr>
           <w:p>
             <w:pPr>
+              <w:jc w:val="center"/>
               <w:rPr>
                 <w:rFonts w:ascii="Cambria" w:eastAsia="Cambria" w:hAnsi="Cambria" w:cs="Cambria"/>
                 <w:b/>
@@ -3143,6 +3142,7 @@
           </w:tcPr>
           <w:p>
             <w:pPr>
+              <w:jc w:val="center"/>
               <w:rPr>
                 <w:rFonts w:ascii="Cambria" w:eastAsia="Cambria" w:hAnsi="Cambria" w:cs="Cambria"/>
                 <w:b/>
@@ -3185,6 +3185,7 @@
           </w:tcPr>
           <w:p>
             <w:pPr>
+              <w:jc w:val="center"/>
               <w:rPr>
                 <w:rFonts w:ascii="Cambria" w:eastAsia="Cambria" w:hAnsi="Cambria" w:cs="Cambria"/>
               </w:rPr>
@@ -3204,6 +3205,7 @@
           </w:tcPr>
           <w:p>
             <w:pPr>
+              <w:jc w:val="center"/>
               <w:rPr>
                 <w:rFonts w:ascii="Cambria" w:eastAsia="Cambria" w:hAnsi="Cambria" w:cs="Cambria"/>
               </w:rPr>
@@ -3228,6 +3230,8 @@
             </w:r>
           </w:p>
         </w:tc>
+        <w:bookmarkStart w:id="0" w:name="_GoBack"/>
+        <w:bookmarkEnd w:id="0"/>
       </w:tr>
     </w:tbl>
     <w:p>
@@ -3914,7 +3918,6 @@
       <w:rPr>
         <w:noProof/>
         <w:color w:val="000000"/>
-        <w:lang w:val="en-PH" w:eastAsia="en-PH"/>
       </w:rPr>
       <w:drawing>
         <wp:inline distT="0" distB="0" distL="0" distR="0" wp14:anchorId="2BA53806" wp14:editId="7C62F8B2">

</xml_diff>

<commit_message>
Remove some logs, edited template for DAR and workstation box checkmark. Workstation and other assets toggle hidden.
</commit_message>
<xml_diff>
--- a/frontend/public/Lab1_DAR.docx
+++ b/frontend/public/Lab1_DAR.docx
@@ -958,18 +958,19 @@
         <w:tblStyle w:val="TableGrid"/>
         <w:tblW w:w="0" w:type="auto"/>
         <w:jc w:val="center"/>
+        <w:tblLayout w:type="fixed"/>
         <w:tblLook w:val="04A0" w:firstRow="1" w:lastRow="0" w:firstColumn="1" w:lastColumn="0" w:noHBand="0" w:noVBand="1"/>
       </w:tblPr>
       <w:tblGrid>
-        <w:gridCol w:w="864"/>
-        <w:gridCol w:w="864"/>
-        <w:gridCol w:w="864"/>
-        <w:gridCol w:w="864"/>
+        <w:gridCol w:w="931"/>
+        <w:gridCol w:w="931"/>
+        <w:gridCol w:w="931"/>
+        <w:gridCol w:w="931"/>
         <w:gridCol w:w="576"/>
-        <w:gridCol w:w="864"/>
-        <w:gridCol w:w="864"/>
-        <w:gridCol w:w="864"/>
-        <w:gridCol w:w="864"/>
+        <w:gridCol w:w="931"/>
+        <w:gridCol w:w="931"/>
+        <w:gridCol w:w="931"/>
+        <w:gridCol w:w="931"/>
       </w:tblGrid>
       <w:tr>
         <w:trPr>
@@ -978,7 +979,7 @@
         </w:trPr>
         <w:tc>
           <w:tcPr>
-            <w:tcW w:w="864" w:type="dxa"/>
+            <w:tcW w:w="931" w:type="dxa"/>
           </w:tcPr>
           <w:p>
             <w:pPr>
@@ -1001,28 +1002,35 @@
           </w:p>
           <w:p>
             <w:pPr>
-              <w:rPr>
-                <w:rFonts w:ascii="Cambria" w:eastAsia="Cambria" w:hAnsi="Cambria" w:cs="Cambria"/>
-                <w:bCs/>
-                <w:sz w:val="20"/>
-                <w:szCs w:val="20"/>
-              </w:rPr>
-            </w:pPr>
-          </w:p>
-          <w:p>
-            <w:pPr>
-              <w:rPr>
-                <w:rFonts w:ascii="Cambria" w:eastAsia="Cambria" w:hAnsi="Cambria" w:cs="Cambria"/>
-                <w:bCs/>
-                <w:sz w:val="20"/>
-                <w:szCs w:val="20"/>
-              </w:rPr>
-            </w:pPr>
-          </w:p>
-        </w:tc>
-        <w:tc>
-          <w:tcPr>
-            <w:tcW w:w="864" w:type="dxa"/>
+              <w:jc w:val="center"/>
+              <w:rPr>
+                <w:rFonts w:ascii="Cambria" w:eastAsia="Cambria" w:hAnsi="Cambria" w:cs="Cambria"/>
+                <w:bCs/>
+                <w:sz w:val="20"/>
+                <w:szCs w:val="20"/>
+              </w:rPr>
+            </w:pPr>
+            <w:r>
+              <w:t>{ws_33</w:t>
+            </w:r>
+            <w:r>
+              <w:t>}</w:t>
+            </w:r>
+          </w:p>
+          <w:p>
+            <w:pPr>
+              <w:rPr>
+                <w:rFonts w:ascii="Cambria" w:eastAsia="Cambria" w:hAnsi="Cambria" w:cs="Cambria"/>
+                <w:bCs/>
+                <w:sz w:val="20"/>
+                <w:szCs w:val="20"/>
+              </w:rPr>
+            </w:pPr>
+          </w:p>
+        </w:tc>
+        <w:tc>
+          <w:tcPr>
+            <w:tcW w:w="931" w:type="dxa"/>
           </w:tcPr>
           <w:p>
             <w:pPr>
@@ -1045,28 +1053,35 @@
           </w:p>
           <w:p>
             <w:pPr>
-              <w:rPr>
-                <w:rFonts w:ascii="Cambria" w:eastAsia="Cambria" w:hAnsi="Cambria" w:cs="Cambria"/>
-                <w:bCs/>
-                <w:sz w:val="20"/>
-                <w:szCs w:val="20"/>
-              </w:rPr>
-            </w:pPr>
-          </w:p>
-          <w:p>
-            <w:pPr>
-              <w:rPr>
-                <w:rFonts w:ascii="Cambria" w:eastAsia="Cambria" w:hAnsi="Cambria" w:cs="Cambria"/>
-                <w:bCs/>
-                <w:sz w:val="20"/>
-                <w:szCs w:val="20"/>
-              </w:rPr>
-            </w:pPr>
-          </w:p>
-        </w:tc>
-        <w:tc>
-          <w:tcPr>
-            <w:tcW w:w="864" w:type="dxa"/>
+              <w:jc w:val="center"/>
+              <w:rPr>
+                <w:rFonts w:ascii="Cambria" w:eastAsia="Cambria" w:hAnsi="Cambria" w:cs="Cambria"/>
+                <w:bCs/>
+                <w:sz w:val="20"/>
+                <w:szCs w:val="20"/>
+              </w:rPr>
+            </w:pPr>
+            <w:r>
+              <w:t>{ws_34</w:t>
+            </w:r>
+            <w:r>
+              <w:t>}</w:t>
+            </w:r>
+          </w:p>
+          <w:p>
+            <w:pPr>
+              <w:rPr>
+                <w:rFonts w:ascii="Cambria" w:eastAsia="Cambria" w:hAnsi="Cambria" w:cs="Cambria"/>
+                <w:bCs/>
+                <w:sz w:val="20"/>
+                <w:szCs w:val="20"/>
+              </w:rPr>
+            </w:pPr>
+          </w:p>
+        </w:tc>
+        <w:tc>
+          <w:tcPr>
+            <w:tcW w:w="931" w:type="dxa"/>
           </w:tcPr>
           <w:p>
             <w:pPr>
@@ -1089,28 +1104,35 @@
           </w:p>
           <w:p>
             <w:pPr>
-              <w:rPr>
-                <w:rFonts w:ascii="Cambria" w:eastAsia="Cambria" w:hAnsi="Cambria" w:cs="Cambria"/>
-                <w:bCs/>
-                <w:sz w:val="20"/>
-                <w:szCs w:val="20"/>
-              </w:rPr>
-            </w:pPr>
-          </w:p>
-          <w:p>
-            <w:pPr>
-              <w:rPr>
-                <w:rFonts w:ascii="Cambria" w:eastAsia="Cambria" w:hAnsi="Cambria" w:cs="Cambria"/>
-                <w:bCs/>
-                <w:sz w:val="20"/>
-                <w:szCs w:val="20"/>
-              </w:rPr>
-            </w:pPr>
-          </w:p>
-        </w:tc>
-        <w:tc>
-          <w:tcPr>
-            <w:tcW w:w="864" w:type="dxa"/>
+              <w:jc w:val="center"/>
+              <w:rPr>
+                <w:rFonts w:ascii="Cambria" w:eastAsia="Cambria" w:hAnsi="Cambria" w:cs="Cambria"/>
+                <w:bCs/>
+                <w:sz w:val="20"/>
+                <w:szCs w:val="20"/>
+              </w:rPr>
+            </w:pPr>
+            <w:r>
+              <w:t>{ws_35</w:t>
+            </w:r>
+            <w:r>
+              <w:t>}</w:t>
+            </w:r>
+          </w:p>
+          <w:p>
+            <w:pPr>
+              <w:rPr>
+                <w:rFonts w:ascii="Cambria" w:eastAsia="Cambria" w:hAnsi="Cambria" w:cs="Cambria"/>
+                <w:bCs/>
+                <w:sz w:val="20"/>
+                <w:szCs w:val="20"/>
+              </w:rPr>
+            </w:pPr>
+          </w:p>
+        </w:tc>
+        <w:tc>
+          <w:tcPr>
+            <w:tcW w:w="931" w:type="dxa"/>
           </w:tcPr>
           <w:p>
             <w:pPr>
@@ -1133,13 +1155,20 @@
           </w:p>
           <w:p>
             <w:pPr>
-              <w:rPr>
-                <w:rFonts w:ascii="Cambria" w:eastAsia="Cambria" w:hAnsi="Cambria" w:cs="Cambria"/>
-                <w:bCs/>
-                <w:sz w:val="20"/>
-                <w:szCs w:val="20"/>
-              </w:rPr>
-            </w:pPr>
+              <w:jc w:val="center"/>
+              <w:rPr>
+                <w:rFonts w:ascii="Cambria" w:eastAsia="Cambria" w:hAnsi="Cambria" w:cs="Cambria"/>
+                <w:bCs/>
+                <w:sz w:val="20"/>
+                <w:szCs w:val="20"/>
+              </w:rPr>
+            </w:pPr>
+            <w:r>
+              <w:t>{ws_36</w:t>
+            </w:r>
+            <w:r>
+              <w:t>}</w:t>
+            </w:r>
           </w:p>
           <w:p>
             <w:pPr>
@@ -1173,7 +1202,7 @@
         </w:tc>
         <w:tc>
           <w:tcPr>
-            <w:tcW w:w="864" w:type="dxa"/>
+            <w:tcW w:w="931" w:type="dxa"/>
           </w:tcPr>
           <w:p>
             <w:pPr>
@@ -1196,28 +1225,35 @@
           </w:p>
           <w:p>
             <w:pPr>
-              <w:rPr>
-                <w:rFonts w:ascii="Cambria" w:eastAsia="Cambria" w:hAnsi="Cambria" w:cs="Cambria"/>
-                <w:bCs/>
-                <w:sz w:val="20"/>
-                <w:szCs w:val="20"/>
-              </w:rPr>
-            </w:pPr>
-          </w:p>
-          <w:p>
-            <w:pPr>
-              <w:rPr>
-                <w:rFonts w:ascii="Cambria" w:eastAsia="Cambria" w:hAnsi="Cambria" w:cs="Cambria"/>
-                <w:bCs/>
-                <w:sz w:val="20"/>
-                <w:szCs w:val="20"/>
-              </w:rPr>
-            </w:pPr>
-          </w:p>
-        </w:tc>
-        <w:tc>
-          <w:tcPr>
-            <w:tcW w:w="864" w:type="dxa"/>
+              <w:jc w:val="center"/>
+              <w:rPr>
+                <w:rFonts w:ascii="Cambria" w:eastAsia="Cambria" w:hAnsi="Cambria" w:cs="Cambria"/>
+                <w:bCs/>
+                <w:sz w:val="20"/>
+                <w:szCs w:val="20"/>
+              </w:rPr>
+            </w:pPr>
+            <w:r>
+              <w:t>{ws_37</w:t>
+            </w:r>
+            <w:r>
+              <w:t>}</w:t>
+            </w:r>
+          </w:p>
+          <w:p>
+            <w:pPr>
+              <w:rPr>
+                <w:rFonts w:ascii="Cambria" w:eastAsia="Cambria" w:hAnsi="Cambria" w:cs="Cambria"/>
+                <w:bCs/>
+                <w:sz w:val="20"/>
+                <w:szCs w:val="20"/>
+              </w:rPr>
+            </w:pPr>
+          </w:p>
+        </w:tc>
+        <w:tc>
+          <w:tcPr>
+            <w:tcW w:w="931" w:type="dxa"/>
           </w:tcPr>
           <w:p>
             <w:pPr>
@@ -1240,28 +1276,35 @@
           </w:p>
           <w:p>
             <w:pPr>
-              <w:rPr>
-                <w:rFonts w:ascii="Cambria" w:eastAsia="Cambria" w:hAnsi="Cambria" w:cs="Cambria"/>
-                <w:bCs/>
-                <w:sz w:val="20"/>
-                <w:szCs w:val="20"/>
-              </w:rPr>
-            </w:pPr>
-          </w:p>
-          <w:p>
-            <w:pPr>
-              <w:rPr>
-                <w:rFonts w:ascii="Cambria" w:eastAsia="Cambria" w:hAnsi="Cambria" w:cs="Cambria"/>
-                <w:bCs/>
-                <w:sz w:val="20"/>
-                <w:szCs w:val="20"/>
-              </w:rPr>
-            </w:pPr>
-          </w:p>
-        </w:tc>
-        <w:tc>
-          <w:tcPr>
-            <w:tcW w:w="864" w:type="dxa"/>
+              <w:jc w:val="center"/>
+              <w:rPr>
+                <w:rFonts w:ascii="Cambria" w:eastAsia="Cambria" w:hAnsi="Cambria" w:cs="Cambria"/>
+                <w:bCs/>
+                <w:sz w:val="20"/>
+                <w:szCs w:val="20"/>
+              </w:rPr>
+            </w:pPr>
+            <w:r>
+              <w:t>{ws_38</w:t>
+            </w:r>
+            <w:r>
+              <w:t>}</w:t>
+            </w:r>
+          </w:p>
+          <w:p>
+            <w:pPr>
+              <w:rPr>
+                <w:rFonts w:ascii="Cambria" w:eastAsia="Cambria" w:hAnsi="Cambria" w:cs="Cambria"/>
+                <w:bCs/>
+                <w:sz w:val="20"/>
+                <w:szCs w:val="20"/>
+              </w:rPr>
+            </w:pPr>
+          </w:p>
+        </w:tc>
+        <w:tc>
+          <w:tcPr>
+            <w:tcW w:w="931" w:type="dxa"/>
           </w:tcPr>
           <w:p>
             <w:pPr>
@@ -1284,28 +1327,35 @@
           </w:p>
           <w:p>
             <w:pPr>
-              <w:rPr>
-                <w:rFonts w:ascii="Cambria" w:eastAsia="Cambria" w:hAnsi="Cambria" w:cs="Cambria"/>
-                <w:bCs/>
-                <w:sz w:val="20"/>
-                <w:szCs w:val="20"/>
-              </w:rPr>
-            </w:pPr>
-          </w:p>
-          <w:p>
-            <w:pPr>
-              <w:rPr>
-                <w:rFonts w:ascii="Cambria" w:eastAsia="Cambria" w:hAnsi="Cambria" w:cs="Cambria"/>
-                <w:bCs/>
-                <w:sz w:val="20"/>
-                <w:szCs w:val="20"/>
-              </w:rPr>
-            </w:pPr>
-          </w:p>
-        </w:tc>
-        <w:tc>
-          <w:tcPr>
-            <w:tcW w:w="864" w:type="dxa"/>
+              <w:jc w:val="center"/>
+              <w:rPr>
+                <w:rFonts w:ascii="Cambria" w:eastAsia="Cambria" w:hAnsi="Cambria" w:cs="Cambria"/>
+                <w:bCs/>
+                <w:sz w:val="20"/>
+                <w:szCs w:val="20"/>
+              </w:rPr>
+            </w:pPr>
+            <w:r>
+              <w:t>{ws_39</w:t>
+            </w:r>
+            <w:r>
+              <w:t>}</w:t>
+            </w:r>
+          </w:p>
+          <w:p>
+            <w:pPr>
+              <w:rPr>
+                <w:rFonts w:ascii="Cambria" w:eastAsia="Cambria" w:hAnsi="Cambria" w:cs="Cambria"/>
+                <w:bCs/>
+                <w:sz w:val="20"/>
+                <w:szCs w:val="20"/>
+              </w:rPr>
+            </w:pPr>
+          </w:p>
+        </w:tc>
+        <w:tc>
+          <w:tcPr>
+            <w:tcW w:w="931" w:type="dxa"/>
           </w:tcPr>
           <w:p>
             <w:pPr>
@@ -1328,13 +1378,20 @@
           </w:p>
           <w:p>
             <w:pPr>
-              <w:rPr>
-                <w:rFonts w:ascii="Cambria" w:eastAsia="Cambria" w:hAnsi="Cambria" w:cs="Cambria"/>
-                <w:bCs/>
-                <w:sz w:val="20"/>
-                <w:szCs w:val="20"/>
-              </w:rPr>
-            </w:pPr>
+              <w:jc w:val="center"/>
+              <w:rPr>
+                <w:rFonts w:ascii="Cambria" w:eastAsia="Cambria" w:hAnsi="Cambria" w:cs="Cambria"/>
+                <w:bCs/>
+                <w:sz w:val="20"/>
+                <w:szCs w:val="20"/>
+              </w:rPr>
+            </w:pPr>
+            <w:r>
+              <w:t>{ws_40</w:t>
+            </w:r>
+            <w:r>
+              <w:t>}</w:t>
+            </w:r>
           </w:p>
           <w:p>
             <w:pPr>
@@ -1355,7 +1412,7 @@
         </w:trPr>
         <w:tc>
           <w:tcPr>
-            <w:tcW w:w="864" w:type="dxa"/>
+            <w:tcW w:w="931" w:type="dxa"/>
           </w:tcPr>
           <w:p>
             <w:pPr>
@@ -1378,28 +1435,35 @@
           </w:p>
           <w:p>
             <w:pPr>
-              <w:rPr>
-                <w:rFonts w:ascii="Cambria" w:eastAsia="Cambria" w:hAnsi="Cambria" w:cs="Cambria"/>
-                <w:bCs/>
-                <w:sz w:val="20"/>
-                <w:szCs w:val="20"/>
-              </w:rPr>
-            </w:pPr>
-          </w:p>
-          <w:p>
-            <w:pPr>
-              <w:rPr>
-                <w:rFonts w:ascii="Cambria" w:eastAsia="Cambria" w:hAnsi="Cambria" w:cs="Cambria"/>
-                <w:bCs/>
-                <w:sz w:val="20"/>
-                <w:szCs w:val="20"/>
-              </w:rPr>
-            </w:pPr>
-          </w:p>
-        </w:tc>
-        <w:tc>
-          <w:tcPr>
-            <w:tcW w:w="864" w:type="dxa"/>
+              <w:jc w:val="center"/>
+              <w:rPr>
+                <w:rFonts w:ascii="Cambria" w:eastAsia="Cambria" w:hAnsi="Cambria" w:cs="Cambria"/>
+                <w:bCs/>
+                <w:sz w:val="20"/>
+                <w:szCs w:val="20"/>
+              </w:rPr>
+            </w:pPr>
+            <w:r>
+              <w:t>{ws_25</w:t>
+            </w:r>
+            <w:r>
+              <w:t>}</w:t>
+            </w:r>
+          </w:p>
+          <w:p>
+            <w:pPr>
+              <w:rPr>
+                <w:rFonts w:ascii="Cambria" w:eastAsia="Cambria" w:hAnsi="Cambria" w:cs="Cambria"/>
+                <w:bCs/>
+                <w:sz w:val="20"/>
+                <w:szCs w:val="20"/>
+              </w:rPr>
+            </w:pPr>
+          </w:p>
+        </w:tc>
+        <w:tc>
+          <w:tcPr>
+            <w:tcW w:w="931" w:type="dxa"/>
           </w:tcPr>
           <w:p>
             <w:pPr>
@@ -1422,28 +1486,35 @@
           </w:p>
           <w:p>
             <w:pPr>
-              <w:rPr>
-                <w:rFonts w:ascii="Cambria" w:eastAsia="Cambria" w:hAnsi="Cambria" w:cs="Cambria"/>
-                <w:bCs/>
-                <w:sz w:val="20"/>
-                <w:szCs w:val="20"/>
-              </w:rPr>
-            </w:pPr>
-          </w:p>
-          <w:p>
-            <w:pPr>
-              <w:rPr>
-                <w:rFonts w:ascii="Cambria" w:eastAsia="Cambria" w:hAnsi="Cambria" w:cs="Cambria"/>
-                <w:bCs/>
-                <w:sz w:val="20"/>
-                <w:szCs w:val="20"/>
-              </w:rPr>
-            </w:pPr>
-          </w:p>
-        </w:tc>
-        <w:tc>
-          <w:tcPr>
-            <w:tcW w:w="864" w:type="dxa"/>
+              <w:jc w:val="center"/>
+              <w:rPr>
+                <w:rFonts w:ascii="Cambria" w:eastAsia="Cambria" w:hAnsi="Cambria" w:cs="Cambria"/>
+                <w:bCs/>
+                <w:sz w:val="20"/>
+                <w:szCs w:val="20"/>
+              </w:rPr>
+            </w:pPr>
+            <w:r>
+              <w:t>{ws_26</w:t>
+            </w:r>
+            <w:r>
+              <w:t>}</w:t>
+            </w:r>
+          </w:p>
+          <w:p>
+            <w:pPr>
+              <w:rPr>
+                <w:rFonts w:ascii="Cambria" w:eastAsia="Cambria" w:hAnsi="Cambria" w:cs="Cambria"/>
+                <w:bCs/>
+                <w:sz w:val="20"/>
+                <w:szCs w:val="20"/>
+              </w:rPr>
+            </w:pPr>
+          </w:p>
+        </w:tc>
+        <w:tc>
+          <w:tcPr>
+            <w:tcW w:w="931" w:type="dxa"/>
           </w:tcPr>
           <w:p>
             <w:pPr>
@@ -1466,28 +1537,35 @@
           </w:p>
           <w:p>
             <w:pPr>
-              <w:rPr>
-                <w:rFonts w:ascii="Cambria" w:eastAsia="Cambria" w:hAnsi="Cambria" w:cs="Cambria"/>
-                <w:bCs/>
-                <w:sz w:val="20"/>
-                <w:szCs w:val="20"/>
-              </w:rPr>
-            </w:pPr>
-          </w:p>
-          <w:p>
-            <w:pPr>
-              <w:rPr>
-                <w:rFonts w:ascii="Cambria" w:eastAsia="Cambria" w:hAnsi="Cambria" w:cs="Cambria"/>
-                <w:bCs/>
-                <w:sz w:val="20"/>
-                <w:szCs w:val="20"/>
-              </w:rPr>
-            </w:pPr>
-          </w:p>
-        </w:tc>
-        <w:tc>
-          <w:tcPr>
-            <w:tcW w:w="864" w:type="dxa"/>
+              <w:jc w:val="center"/>
+              <w:rPr>
+                <w:rFonts w:ascii="Cambria" w:eastAsia="Cambria" w:hAnsi="Cambria" w:cs="Cambria"/>
+                <w:bCs/>
+                <w:sz w:val="20"/>
+                <w:szCs w:val="20"/>
+              </w:rPr>
+            </w:pPr>
+            <w:r>
+              <w:t>{ws_27</w:t>
+            </w:r>
+            <w:r>
+              <w:t>}</w:t>
+            </w:r>
+          </w:p>
+          <w:p>
+            <w:pPr>
+              <w:rPr>
+                <w:rFonts w:ascii="Cambria" w:eastAsia="Cambria" w:hAnsi="Cambria" w:cs="Cambria"/>
+                <w:bCs/>
+                <w:sz w:val="20"/>
+                <w:szCs w:val="20"/>
+              </w:rPr>
+            </w:pPr>
+          </w:p>
+        </w:tc>
+        <w:tc>
+          <w:tcPr>
+            <w:tcW w:w="931" w:type="dxa"/>
           </w:tcPr>
           <w:p>
             <w:pPr>
@@ -1510,13 +1588,20 @@
           </w:p>
           <w:p>
             <w:pPr>
-              <w:rPr>
-                <w:rFonts w:ascii="Cambria" w:eastAsia="Cambria" w:hAnsi="Cambria" w:cs="Cambria"/>
-                <w:bCs/>
-                <w:sz w:val="20"/>
-                <w:szCs w:val="20"/>
-              </w:rPr>
-            </w:pPr>
+              <w:jc w:val="center"/>
+              <w:rPr>
+                <w:rFonts w:ascii="Cambria" w:eastAsia="Cambria" w:hAnsi="Cambria" w:cs="Cambria"/>
+                <w:bCs/>
+                <w:sz w:val="20"/>
+                <w:szCs w:val="20"/>
+              </w:rPr>
+            </w:pPr>
+            <w:r>
+              <w:t>{ws_28</w:t>
+            </w:r>
+            <w:r>
+              <w:t>}</w:t>
+            </w:r>
           </w:p>
           <w:p>
             <w:pPr>
@@ -1550,7 +1635,7 @@
         </w:tc>
         <w:tc>
           <w:tcPr>
-            <w:tcW w:w="864" w:type="dxa"/>
+            <w:tcW w:w="931" w:type="dxa"/>
           </w:tcPr>
           <w:p>
             <w:pPr>
@@ -1573,28 +1658,35 @@
           </w:p>
           <w:p>
             <w:pPr>
-              <w:rPr>
-                <w:rFonts w:ascii="Cambria" w:eastAsia="Cambria" w:hAnsi="Cambria" w:cs="Cambria"/>
-                <w:bCs/>
-                <w:sz w:val="20"/>
-                <w:szCs w:val="20"/>
-              </w:rPr>
-            </w:pPr>
-          </w:p>
-          <w:p>
-            <w:pPr>
-              <w:rPr>
-                <w:rFonts w:ascii="Cambria" w:eastAsia="Cambria" w:hAnsi="Cambria" w:cs="Cambria"/>
-                <w:bCs/>
-                <w:sz w:val="20"/>
-                <w:szCs w:val="20"/>
-              </w:rPr>
-            </w:pPr>
-          </w:p>
-        </w:tc>
-        <w:tc>
-          <w:tcPr>
-            <w:tcW w:w="864" w:type="dxa"/>
+              <w:jc w:val="center"/>
+              <w:rPr>
+                <w:rFonts w:ascii="Cambria" w:eastAsia="Cambria" w:hAnsi="Cambria" w:cs="Cambria"/>
+                <w:bCs/>
+                <w:sz w:val="20"/>
+                <w:szCs w:val="20"/>
+              </w:rPr>
+            </w:pPr>
+            <w:r>
+              <w:t>{ws_29</w:t>
+            </w:r>
+            <w:r>
+              <w:t>}</w:t>
+            </w:r>
+          </w:p>
+          <w:p>
+            <w:pPr>
+              <w:rPr>
+                <w:rFonts w:ascii="Cambria" w:eastAsia="Cambria" w:hAnsi="Cambria" w:cs="Cambria"/>
+                <w:bCs/>
+                <w:sz w:val="20"/>
+                <w:szCs w:val="20"/>
+              </w:rPr>
+            </w:pPr>
+          </w:p>
+        </w:tc>
+        <w:tc>
+          <w:tcPr>
+            <w:tcW w:w="931" w:type="dxa"/>
           </w:tcPr>
           <w:p>
             <w:pPr>
@@ -1617,28 +1709,35 @@
           </w:p>
           <w:p>
             <w:pPr>
-              <w:rPr>
-                <w:rFonts w:ascii="Cambria" w:eastAsia="Cambria" w:hAnsi="Cambria" w:cs="Cambria"/>
-                <w:bCs/>
-                <w:sz w:val="20"/>
-                <w:szCs w:val="20"/>
-              </w:rPr>
-            </w:pPr>
-          </w:p>
-          <w:p>
-            <w:pPr>
-              <w:rPr>
-                <w:rFonts w:ascii="Cambria" w:eastAsia="Cambria" w:hAnsi="Cambria" w:cs="Cambria"/>
-                <w:bCs/>
-                <w:sz w:val="20"/>
-                <w:szCs w:val="20"/>
-              </w:rPr>
-            </w:pPr>
-          </w:p>
-        </w:tc>
-        <w:tc>
-          <w:tcPr>
-            <w:tcW w:w="864" w:type="dxa"/>
+              <w:jc w:val="center"/>
+              <w:rPr>
+                <w:rFonts w:ascii="Cambria" w:eastAsia="Cambria" w:hAnsi="Cambria" w:cs="Cambria"/>
+                <w:bCs/>
+                <w:sz w:val="20"/>
+                <w:szCs w:val="20"/>
+              </w:rPr>
+            </w:pPr>
+            <w:r>
+              <w:t>{ws_30</w:t>
+            </w:r>
+            <w:r>
+              <w:t>}</w:t>
+            </w:r>
+          </w:p>
+          <w:p>
+            <w:pPr>
+              <w:rPr>
+                <w:rFonts w:ascii="Cambria" w:eastAsia="Cambria" w:hAnsi="Cambria" w:cs="Cambria"/>
+                <w:bCs/>
+                <w:sz w:val="20"/>
+                <w:szCs w:val="20"/>
+              </w:rPr>
+            </w:pPr>
+          </w:p>
+        </w:tc>
+        <w:tc>
+          <w:tcPr>
+            <w:tcW w:w="931" w:type="dxa"/>
           </w:tcPr>
           <w:p>
             <w:pPr>
@@ -1661,28 +1760,38 @@
           </w:p>
           <w:p>
             <w:pPr>
-              <w:rPr>
-                <w:rFonts w:ascii="Cambria" w:eastAsia="Cambria" w:hAnsi="Cambria" w:cs="Cambria"/>
-                <w:bCs/>
-                <w:sz w:val="20"/>
-                <w:szCs w:val="20"/>
-              </w:rPr>
-            </w:pPr>
-          </w:p>
-          <w:p>
-            <w:pPr>
-              <w:rPr>
-                <w:rFonts w:ascii="Cambria" w:eastAsia="Cambria" w:hAnsi="Cambria" w:cs="Cambria"/>
-                <w:bCs/>
-                <w:sz w:val="20"/>
-                <w:szCs w:val="20"/>
-              </w:rPr>
-            </w:pPr>
-          </w:p>
-        </w:tc>
-        <w:tc>
-          <w:tcPr>
-            <w:tcW w:w="864" w:type="dxa"/>
+              <w:jc w:val="center"/>
+              <w:rPr>
+                <w:rFonts w:ascii="Cambria" w:eastAsia="Cambria" w:hAnsi="Cambria" w:cs="Cambria"/>
+                <w:bCs/>
+                <w:sz w:val="20"/>
+                <w:szCs w:val="20"/>
+              </w:rPr>
+            </w:pPr>
+            <w:r>
+              <w:t>{ws_</w:t>
+            </w:r>
+            <w:r>
+              <w:t>3</w:t>
+            </w:r>
+            <w:r>
+              <w:t>1}</w:t>
+            </w:r>
+          </w:p>
+          <w:p>
+            <w:pPr>
+              <w:rPr>
+                <w:rFonts w:ascii="Cambria" w:eastAsia="Cambria" w:hAnsi="Cambria" w:cs="Cambria"/>
+                <w:bCs/>
+                <w:sz w:val="20"/>
+                <w:szCs w:val="20"/>
+              </w:rPr>
+            </w:pPr>
+          </w:p>
+        </w:tc>
+        <w:tc>
+          <w:tcPr>
+            <w:tcW w:w="931" w:type="dxa"/>
           </w:tcPr>
           <w:p>
             <w:pPr>
@@ -1705,13 +1814,20 @@
           </w:p>
           <w:p>
             <w:pPr>
-              <w:rPr>
-                <w:rFonts w:ascii="Cambria" w:eastAsia="Cambria" w:hAnsi="Cambria" w:cs="Cambria"/>
-                <w:bCs/>
-                <w:sz w:val="20"/>
-                <w:szCs w:val="20"/>
-              </w:rPr>
-            </w:pPr>
+              <w:jc w:val="center"/>
+              <w:rPr>
+                <w:rFonts w:ascii="Cambria" w:eastAsia="Cambria" w:hAnsi="Cambria" w:cs="Cambria"/>
+                <w:bCs/>
+                <w:sz w:val="20"/>
+                <w:szCs w:val="20"/>
+              </w:rPr>
+            </w:pPr>
+            <w:r>
+              <w:t>{ws_32</w:t>
+            </w:r>
+            <w:r>
+              <w:t>}</w:t>
+            </w:r>
           </w:p>
           <w:p>
             <w:pPr>
@@ -1732,7 +1848,7 @@
         </w:trPr>
         <w:tc>
           <w:tcPr>
-            <w:tcW w:w="864" w:type="dxa"/>
+            <w:tcW w:w="931" w:type="dxa"/>
           </w:tcPr>
           <w:p>
             <w:pPr>
@@ -1755,28 +1871,38 @@
           </w:p>
           <w:p>
             <w:pPr>
-              <w:rPr>
-                <w:rFonts w:ascii="Cambria" w:eastAsia="Cambria" w:hAnsi="Cambria" w:cs="Cambria"/>
-                <w:bCs/>
-                <w:sz w:val="20"/>
-                <w:szCs w:val="20"/>
-              </w:rPr>
-            </w:pPr>
-          </w:p>
-          <w:p>
-            <w:pPr>
-              <w:rPr>
-                <w:rFonts w:ascii="Cambria" w:eastAsia="Cambria" w:hAnsi="Cambria" w:cs="Cambria"/>
-                <w:bCs/>
-                <w:sz w:val="20"/>
-                <w:szCs w:val="20"/>
-              </w:rPr>
-            </w:pPr>
-          </w:p>
-        </w:tc>
-        <w:tc>
-          <w:tcPr>
-            <w:tcW w:w="864" w:type="dxa"/>
+              <w:jc w:val="center"/>
+              <w:rPr>
+                <w:rFonts w:ascii="Cambria" w:eastAsia="Cambria" w:hAnsi="Cambria" w:cs="Cambria"/>
+                <w:bCs/>
+                <w:sz w:val="20"/>
+                <w:szCs w:val="20"/>
+              </w:rPr>
+            </w:pPr>
+            <w:r>
+              <w:t>{ws_1</w:t>
+            </w:r>
+            <w:r>
+              <w:t>7</w:t>
+            </w:r>
+            <w:r>
+              <w:t>}</w:t>
+            </w:r>
+          </w:p>
+          <w:p>
+            <w:pPr>
+              <w:rPr>
+                <w:rFonts w:ascii="Cambria" w:eastAsia="Cambria" w:hAnsi="Cambria" w:cs="Cambria"/>
+                <w:bCs/>
+                <w:sz w:val="20"/>
+                <w:szCs w:val="20"/>
+              </w:rPr>
+            </w:pPr>
+          </w:p>
+        </w:tc>
+        <w:tc>
+          <w:tcPr>
+            <w:tcW w:w="931" w:type="dxa"/>
           </w:tcPr>
           <w:p>
             <w:pPr>
@@ -1799,28 +1925,38 @@
           </w:p>
           <w:p>
             <w:pPr>
-              <w:rPr>
-                <w:rFonts w:ascii="Cambria" w:eastAsia="Cambria" w:hAnsi="Cambria" w:cs="Cambria"/>
-                <w:bCs/>
-                <w:sz w:val="20"/>
-                <w:szCs w:val="20"/>
-              </w:rPr>
-            </w:pPr>
-          </w:p>
-          <w:p>
-            <w:pPr>
-              <w:rPr>
-                <w:rFonts w:ascii="Cambria" w:eastAsia="Cambria" w:hAnsi="Cambria" w:cs="Cambria"/>
-                <w:bCs/>
-                <w:sz w:val="20"/>
-                <w:szCs w:val="20"/>
-              </w:rPr>
-            </w:pPr>
-          </w:p>
-        </w:tc>
-        <w:tc>
-          <w:tcPr>
-            <w:tcW w:w="864" w:type="dxa"/>
+              <w:jc w:val="center"/>
+              <w:rPr>
+                <w:rFonts w:ascii="Cambria" w:eastAsia="Cambria" w:hAnsi="Cambria" w:cs="Cambria"/>
+                <w:bCs/>
+                <w:sz w:val="20"/>
+                <w:szCs w:val="20"/>
+              </w:rPr>
+            </w:pPr>
+            <w:r>
+              <w:t>{ws_1</w:t>
+            </w:r>
+            <w:r>
+              <w:t>8</w:t>
+            </w:r>
+            <w:r>
+              <w:t>}</w:t>
+            </w:r>
+          </w:p>
+          <w:p>
+            <w:pPr>
+              <w:rPr>
+                <w:rFonts w:ascii="Cambria" w:eastAsia="Cambria" w:hAnsi="Cambria" w:cs="Cambria"/>
+                <w:bCs/>
+                <w:sz w:val="20"/>
+                <w:szCs w:val="20"/>
+              </w:rPr>
+            </w:pPr>
+          </w:p>
+        </w:tc>
+        <w:tc>
+          <w:tcPr>
+            <w:tcW w:w="931" w:type="dxa"/>
           </w:tcPr>
           <w:p>
             <w:pPr>
@@ -1843,28 +1979,38 @@
           </w:p>
           <w:p>
             <w:pPr>
-              <w:rPr>
-                <w:rFonts w:ascii="Cambria" w:eastAsia="Cambria" w:hAnsi="Cambria" w:cs="Cambria"/>
-                <w:bCs/>
-                <w:sz w:val="20"/>
-                <w:szCs w:val="20"/>
-              </w:rPr>
-            </w:pPr>
-          </w:p>
-          <w:p>
-            <w:pPr>
-              <w:rPr>
-                <w:rFonts w:ascii="Cambria" w:eastAsia="Cambria" w:hAnsi="Cambria" w:cs="Cambria"/>
-                <w:bCs/>
-                <w:sz w:val="20"/>
-                <w:szCs w:val="20"/>
-              </w:rPr>
-            </w:pPr>
-          </w:p>
-        </w:tc>
-        <w:tc>
-          <w:tcPr>
-            <w:tcW w:w="864" w:type="dxa"/>
+              <w:jc w:val="center"/>
+              <w:rPr>
+                <w:rFonts w:ascii="Cambria" w:eastAsia="Cambria" w:hAnsi="Cambria" w:cs="Cambria"/>
+                <w:bCs/>
+                <w:sz w:val="20"/>
+                <w:szCs w:val="20"/>
+              </w:rPr>
+            </w:pPr>
+            <w:r>
+              <w:t>{ws_1</w:t>
+            </w:r>
+            <w:r>
+              <w:t>9</w:t>
+            </w:r>
+            <w:r>
+              <w:t>}</w:t>
+            </w:r>
+          </w:p>
+          <w:p>
+            <w:pPr>
+              <w:rPr>
+                <w:rFonts w:ascii="Cambria" w:eastAsia="Cambria" w:hAnsi="Cambria" w:cs="Cambria"/>
+                <w:bCs/>
+                <w:sz w:val="20"/>
+                <w:szCs w:val="20"/>
+              </w:rPr>
+            </w:pPr>
+          </w:p>
+        </w:tc>
+        <w:tc>
+          <w:tcPr>
+            <w:tcW w:w="931" w:type="dxa"/>
           </w:tcPr>
           <w:p>
             <w:pPr>
@@ -1887,13 +2033,20 @@
           </w:p>
           <w:p>
             <w:pPr>
-              <w:rPr>
-                <w:rFonts w:ascii="Cambria" w:eastAsia="Cambria" w:hAnsi="Cambria" w:cs="Cambria"/>
-                <w:bCs/>
-                <w:sz w:val="20"/>
-                <w:szCs w:val="20"/>
-              </w:rPr>
-            </w:pPr>
+              <w:jc w:val="center"/>
+              <w:rPr>
+                <w:rFonts w:ascii="Cambria" w:eastAsia="Cambria" w:hAnsi="Cambria" w:cs="Cambria"/>
+                <w:bCs/>
+                <w:sz w:val="20"/>
+                <w:szCs w:val="20"/>
+              </w:rPr>
+            </w:pPr>
+            <w:r>
+              <w:t>{ws_20</w:t>
+            </w:r>
+            <w:r>
+              <w:t>}</w:t>
+            </w:r>
           </w:p>
           <w:p>
             <w:pPr>
@@ -1927,7 +2080,7 @@
         </w:tc>
         <w:tc>
           <w:tcPr>
-            <w:tcW w:w="864" w:type="dxa"/>
+            <w:tcW w:w="931" w:type="dxa"/>
           </w:tcPr>
           <w:p>
             <w:pPr>
@@ -1950,28 +2103,38 @@
           </w:p>
           <w:p>
             <w:pPr>
-              <w:rPr>
-                <w:rFonts w:ascii="Cambria" w:eastAsia="Cambria" w:hAnsi="Cambria" w:cs="Cambria"/>
-                <w:bCs/>
-                <w:sz w:val="20"/>
-                <w:szCs w:val="20"/>
-              </w:rPr>
-            </w:pPr>
-          </w:p>
-          <w:p>
-            <w:pPr>
-              <w:rPr>
-                <w:rFonts w:ascii="Cambria" w:eastAsia="Cambria" w:hAnsi="Cambria" w:cs="Cambria"/>
-                <w:bCs/>
-                <w:sz w:val="20"/>
-                <w:szCs w:val="20"/>
-              </w:rPr>
-            </w:pPr>
-          </w:p>
-        </w:tc>
-        <w:tc>
-          <w:tcPr>
-            <w:tcW w:w="864" w:type="dxa"/>
+              <w:jc w:val="center"/>
+              <w:rPr>
+                <w:rFonts w:ascii="Cambria" w:eastAsia="Cambria" w:hAnsi="Cambria" w:cs="Cambria"/>
+                <w:bCs/>
+                <w:sz w:val="20"/>
+                <w:szCs w:val="20"/>
+              </w:rPr>
+            </w:pPr>
+            <w:r>
+              <w:t>{ws_</w:t>
+            </w:r>
+            <w:r>
+              <w:t>2</w:t>
+            </w:r>
+            <w:r>
+              <w:t>1}</w:t>
+            </w:r>
+          </w:p>
+          <w:p>
+            <w:pPr>
+              <w:rPr>
+                <w:rFonts w:ascii="Cambria" w:eastAsia="Cambria" w:hAnsi="Cambria" w:cs="Cambria"/>
+                <w:bCs/>
+                <w:sz w:val="20"/>
+                <w:szCs w:val="20"/>
+              </w:rPr>
+            </w:pPr>
+          </w:p>
+        </w:tc>
+        <w:tc>
+          <w:tcPr>
+            <w:tcW w:w="931" w:type="dxa"/>
           </w:tcPr>
           <w:p>
             <w:pPr>
@@ -1994,28 +2157,35 @@
           </w:p>
           <w:p>
             <w:pPr>
-              <w:rPr>
-                <w:rFonts w:ascii="Cambria" w:eastAsia="Cambria" w:hAnsi="Cambria" w:cs="Cambria"/>
-                <w:bCs/>
-                <w:sz w:val="20"/>
-                <w:szCs w:val="20"/>
-              </w:rPr>
-            </w:pPr>
-          </w:p>
-          <w:p>
-            <w:pPr>
-              <w:rPr>
-                <w:rFonts w:ascii="Cambria" w:eastAsia="Cambria" w:hAnsi="Cambria" w:cs="Cambria"/>
-                <w:bCs/>
-                <w:sz w:val="20"/>
-                <w:szCs w:val="20"/>
-              </w:rPr>
-            </w:pPr>
-          </w:p>
-        </w:tc>
-        <w:tc>
-          <w:tcPr>
-            <w:tcW w:w="864" w:type="dxa"/>
+              <w:jc w:val="center"/>
+              <w:rPr>
+                <w:rFonts w:ascii="Cambria" w:eastAsia="Cambria" w:hAnsi="Cambria" w:cs="Cambria"/>
+                <w:bCs/>
+                <w:sz w:val="20"/>
+                <w:szCs w:val="20"/>
+              </w:rPr>
+            </w:pPr>
+            <w:r>
+              <w:t>{ws_22</w:t>
+            </w:r>
+            <w:r>
+              <w:t>}</w:t>
+            </w:r>
+          </w:p>
+          <w:p>
+            <w:pPr>
+              <w:rPr>
+                <w:rFonts w:ascii="Cambria" w:eastAsia="Cambria" w:hAnsi="Cambria" w:cs="Cambria"/>
+                <w:bCs/>
+                <w:sz w:val="20"/>
+                <w:szCs w:val="20"/>
+              </w:rPr>
+            </w:pPr>
+          </w:p>
+        </w:tc>
+        <w:tc>
+          <w:tcPr>
+            <w:tcW w:w="931" w:type="dxa"/>
           </w:tcPr>
           <w:p>
             <w:pPr>
@@ -2038,28 +2208,35 @@
           </w:p>
           <w:p>
             <w:pPr>
-              <w:rPr>
-                <w:rFonts w:ascii="Cambria" w:eastAsia="Cambria" w:hAnsi="Cambria" w:cs="Cambria"/>
-                <w:bCs/>
-                <w:sz w:val="20"/>
-                <w:szCs w:val="20"/>
-              </w:rPr>
-            </w:pPr>
-          </w:p>
-          <w:p>
-            <w:pPr>
-              <w:rPr>
-                <w:rFonts w:ascii="Cambria" w:eastAsia="Cambria" w:hAnsi="Cambria" w:cs="Cambria"/>
-                <w:bCs/>
-                <w:sz w:val="20"/>
-                <w:szCs w:val="20"/>
-              </w:rPr>
-            </w:pPr>
-          </w:p>
-        </w:tc>
-        <w:tc>
-          <w:tcPr>
-            <w:tcW w:w="864" w:type="dxa"/>
+              <w:jc w:val="center"/>
+              <w:rPr>
+                <w:rFonts w:ascii="Cambria" w:eastAsia="Cambria" w:hAnsi="Cambria" w:cs="Cambria"/>
+                <w:bCs/>
+                <w:sz w:val="20"/>
+                <w:szCs w:val="20"/>
+              </w:rPr>
+            </w:pPr>
+            <w:r>
+              <w:t>{ws_23</w:t>
+            </w:r>
+            <w:r>
+              <w:t>}</w:t>
+            </w:r>
+          </w:p>
+          <w:p>
+            <w:pPr>
+              <w:rPr>
+                <w:rFonts w:ascii="Cambria" w:eastAsia="Cambria" w:hAnsi="Cambria" w:cs="Cambria"/>
+                <w:bCs/>
+                <w:sz w:val="20"/>
+                <w:szCs w:val="20"/>
+              </w:rPr>
+            </w:pPr>
+          </w:p>
+        </w:tc>
+        <w:tc>
+          <w:tcPr>
+            <w:tcW w:w="931" w:type="dxa"/>
           </w:tcPr>
           <w:p>
             <w:pPr>
@@ -2082,25 +2259,34 @@
           </w:p>
           <w:p>
             <w:pPr>
-              <w:rPr>
-                <w:rFonts w:ascii="Cambria" w:eastAsia="Cambria" w:hAnsi="Cambria" w:cs="Cambria"/>
-                <w:bCs/>
-                <w:sz w:val="20"/>
-                <w:szCs w:val="20"/>
-              </w:rPr>
-            </w:pPr>
-          </w:p>
-          <w:p>
-            <w:pPr>
-              <w:rPr>
-                <w:rFonts w:ascii="Cambria" w:eastAsia="Cambria" w:hAnsi="Cambria" w:cs="Cambria"/>
-                <w:bCs/>
-                <w:sz w:val="20"/>
-                <w:szCs w:val="20"/>
-              </w:rPr>
-            </w:pPr>
-          </w:p>
-        </w:tc>
+              <w:jc w:val="center"/>
+              <w:rPr>
+                <w:rFonts w:ascii="Cambria" w:eastAsia="Cambria" w:hAnsi="Cambria" w:cs="Cambria"/>
+                <w:bCs/>
+                <w:sz w:val="20"/>
+                <w:szCs w:val="20"/>
+              </w:rPr>
+            </w:pPr>
+            <w:r>
+              <w:t>{ws_24</w:t>
+            </w:r>
+            <w:r>
+              <w:t>}</w:t>
+            </w:r>
+          </w:p>
+          <w:p>
+            <w:pPr>
+              <w:rPr>
+                <w:rFonts w:ascii="Cambria" w:eastAsia="Cambria" w:hAnsi="Cambria" w:cs="Cambria"/>
+                <w:bCs/>
+                <w:sz w:val="20"/>
+                <w:szCs w:val="20"/>
+              </w:rPr>
+            </w:pPr>
+          </w:p>
+        </w:tc>
+        <w:bookmarkStart w:id="0" w:name="_GoBack"/>
+        <w:bookmarkEnd w:id="0"/>
       </w:tr>
       <w:tr>
         <w:trPr>
@@ -2109,7 +2295,7 @@
         </w:trPr>
         <w:tc>
           <w:tcPr>
-            <w:tcW w:w="864" w:type="dxa"/>
+            <w:tcW w:w="931" w:type="dxa"/>
           </w:tcPr>
           <w:p>
             <w:pPr>
@@ -2132,28 +2318,38 @@
           </w:p>
           <w:p>
             <w:pPr>
-              <w:rPr>
-                <w:rFonts w:ascii="Cambria" w:eastAsia="Cambria" w:hAnsi="Cambria" w:cs="Cambria"/>
-                <w:bCs/>
-                <w:sz w:val="20"/>
-                <w:szCs w:val="20"/>
-              </w:rPr>
-            </w:pPr>
-          </w:p>
-          <w:p>
-            <w:pPr>
-              <w:rPr>
-                <w:rFonts w:ascii="Cambria" w:eastAsia="Cambria" w:hAnsi="Cambria" w:cs="Cambria"/>
-                <w:bCs/>
-                <w:sz w:val="20"/>
-                <w:szCs w:val="20"/>
-              </w:rPr>
-            </w:pPr>
-          </w:p>
-        </w:tc>
-        <w:tc>
-          <w:tcPr>
-            <w:tcW w:w="864" w:type="dxa"/>
+              <w:jc w:val="center"/>
+              <w:rPr>
+                <w:rFonts w:ascii="Cambria" w:eastAsia="Cambria" w:hAnsi="Cambria" w:cs="Cambria"/>
+                <w:bCs/>
+                <w:sz w:val="20"/>
+                <w:szCs w:val="20"/>
+              </w:rPr>
+            </w:pPr>
+            <w:r>
+              <w:t>{ws_</w:t>
+            </w:r>
+            <w:r>
+              <w:t>9</w:t>
+            </w:r>
+            <w:r>
+              <w:t>}</w:t>
+            </w:r>
+          </w:p>
+          <w:p>
+            <w:pPr>
+              <w:rPr>
+                <w:rFonts w:ascii="Cambria" w:eastAsia="Cambria" w:hAnsi="Cambria" w:cs="Cambria"/>
+                <w:bCs/>
+                <w:sz w:val="20"/>
+                <w:szCs w:val="20"/>
+              </w:rPr>
+            </w:pPr>
+          </w:p>
+        </w:tc>
+        <w:tc>
+          <w:tcPr>
+            <w:tcW w:w="931" w:type="dxa"/>
           </w:tcPr>
           <w:p>
             <w:pPr>
@@ -2176,28 +2372,38 @@
           </w:p>
           <w:p>
             <w:pPr>
-              <w:rPr>
-                <w:rFonts w:ascii="Cambria" w:eastAsia="Cambria" w:hAnsi="Cambria" w:cs="Cambria"/>
-                <w:bCs/>
-                <w:sz w:val="20"/>
-                <w:szCs w:val="20"/>
-              </w:rPr>
-            </w:pPr>
-          </w:p>
-          <w:p>
-            <w:pPr>
-              <w:rPr>
-                <w:rFonts w:ascii="Cambria" w:eastAsia="Cambria" w:hAnsi="Cambria" w:cs="Cambria"/>
-                <w:bCs/>
-                <w:sz w:val="20"/>
-                <w:szCs w:val="20"/>
-              </w:rPr>
-            </w:pPr>
-          </w:p>
-        </w:tc>
-        <w:tc>
-          <w:tcPr>
-            <w:tcW w:w="864" w:type="dxa"/>
+              <w:jc w:val="center"/>
+              <w:rPr>
+                <w:rFonts w:ascii="Cambria" w:eastAsia="Cambria" w:hAnsi="Cambria" w:cs="Cambria"/>
+                <w:bCs/>
+                <w:sz w:val="20"/>
+                <w:szCs w:val="20"/>
+              </w:rPr>
+            </w:pPr>
+            <w:r>
+              <w:t>{ws_1</w:t>
+            </w:r>
+            <w:r>
+              <w:t>0</w:t>
+            </w:r>
+            <w:r>
+              <w:t>}</w:t>
+            </w:r>
+          </w:p>
+          <w:p>
+            <w:pPr>
+              <w:rPr>
+                <w:rFonts w:ascii="Cambria" w:eastAsia="Cambria" w:hAnsi="Cambria" w:cs="Cambria"/>
+                <w:bCs/>
+                <w:sz w:val="20"/>
+                <w:szCs w:val="20"/>
+              </w:rPr>
+            </w:pPr>
+          </w:p>
+        </w:tc>
+        <w:tc>
+          <w:tcPr>
+            <w:tcW w:w="931" w:type="dxa"/>
           </w:tcPr>
           <w:p>
             <w:pPr>
@@ -2220,28 +2426,38 @@
           </w:p>
           <w:p>
             <w:pPr>
-              <w:rPr>
-                <w:rFonts w:ascii="Cambria" w:eastAsia="Cambria" w:hAnsi="Cambria" w:cs="Cambria"/>
-                <w:bCs/>
-                <w:sz w:val="20"/>
-                <w:szCs w:val="20"/>
-              </w:rPr>
-            </w:pPr>
-          </w:p>
-          <w:p>
-            <w:pPr>
-              <w:rPr>
-                <w:rFonts w:ascii="Cambria" w:eastAsia="Cambria" w:hAnsi="Cambria" w:cs="Cambria"/>
-                <w:bCs/>
-                <w:sz w:val="20"/>
-                <w:szCs w:val="20"/>
-              </w:rPr>
-            </w:pPr>
-          </w:p>
-        </w:tc>
-        <w:tc>
-          <w:tcPr>
-            <w:tcW w:w="864" w:type="dxa"/>
+              <w:jc w:val="center"/>
+              <w:rPr>
+                <w:rFonts w:ascii="Cambria" w:eastAsia="Cambria" w:hAnsi="Cambria" w:cs="Cambria"/>
+                <w:bCs/>
+                <w:sz w:val="20"/>
+                <w:szCs w:val="20"/>
+              </w:rPr>
+            </w:pPr>
+            <w:r>
+              <w:t>{ws_</w:t>
+            </w:r>
+            <w:r>
+              <w:t>11</w:t>
+            </w:r>
+            <w:r>
+              <w:t>}</w:t>
+            </w:r>
+          </w:p>
+          <w:p>
+            <w:pPr>
+              <w:rPr>
+                <w:rFonts w:ascii="Cambria" w:eastAsia="Cambria" w:hAnsi="Cambria" w:cs="Cambria"/>
+                <w:bCs/>
+                <w:sz w:val="20"/>
+                <w:szCs w:val="20"/>
+              </w:rPr>
+            </w:pPr>
+          </w:p>
+        </w:tc>
+        <w:tc>
+          <w:tcPr>
+            <w:tcW w:w="931" w:type="dxa"/>
           </w:tcPr>
           <w:p>
             <w:pPr>
@@ -2264,13 +2480,23 @@
           </w:p>
           <w:p>
             <w:pPr>
-              <w:rPr>
-                <w:rFonts w:ascii="Cambria" w:eastAsia="Cambria" w:hAnsi="Cambria" w:cs="Cambria"/>
-                <w:bCs/>
-                <w:sz w:val="20"/>
-                <w:szCs w:val="20"/>
-              </w:rPr>
-            </w:pPr>
+              <w:jc w:val="center"/>
+              <w:rPr>
+                <w:rFonts w:ascii="Cambria" w:eastAsia="Cambria" w:hAnsi="Cambria" w:cs="Cambria"/>
+                <w:bCs/>
+                <w:sz w:val="20"/>
+                <w:szCs w:val="20"/>
+              </w:rPr>
+            </w:pPr>
+            <w:r>
+              <w:t>{ws_1</w:t>
+            </w:r>
+            <w:r>
+              <w:t>2</w:t>
+            </w:r>
+            <w:r>
+              <w:t>}</w:t>
+            </w:r>
           </w:p>
           <w:p>
             <w:pPr>
@@ -2304,7 +2530,7 @@
         </w:tc>
         <w:tc>
           <w:tcPr>
-            <w:tcW w:w="864" w:type="dxa"/>
+            <w:tcW w:w="931" w:type="dxa"/>
           </w:tcPr>
           <w:p>
             <w:pPr>
@@ -2327,28 +2553,38 @@
           </w:p>
           <w:p>
             <w:pPr>
-              <w:rPr>
-                <w:rFonts w:ascii="Cambria" w:eastAsia="Cambria" w:hAnsi="Cambria" w:cs="Cambria"/>
-                <w:bCs/>
-                <w:sz w:val="20"/>
-                <w:szCs w:val="20"/>
-              </w:rPr>
-            </w:pPr>
-          </w:p>
-          <w:p>
-            <w:pPr>
-              <w:rPr>
-                <w:rFonts w:ascii="Cambria" w:eastAsia="Cambria" w:hAnsi="Cambria" w:cs="Cambria"/>
-                <w:bCs/>
-                <w:sz w:val="20"/>
-                <w:szCs w:val="20"/>
-              </w:rPr>
-            </w:pPr>
-          </w:p>
-        </w:tc>
-        <w:tc>
-          <w:tcPr>
-            <w:tcW w:w="864" w:type="dxa"/>
+              <w:jc w:val="center"/>
+              <w:rPr>
+                <w:rFonts w:ascii="Cambria" w:eastAsia="Cambria" w:hAnsi="Cambria" w:cs="Cambria"/>
+                <w:bCs/>
+                <w:sz w:val="20"/>
+                <w:szCs w:val="20"/>
+              </w:rPr>
+            </w:pPr>
+            <w:r>
+              <w:t>{ws_1</w:t>
+            </w:r>
+            <w:r>
+              <w:t>3</w:t>
+            </w:r>
+            <w:r>
+              <w:t>}</w:t>
+            </w:r>
+          </w:p>
+          <w:p>
+            <w:pPr>
+              <w:rPr>
+                <w:rFonts w:ascii="Cambria" w:eastAsia="Cambria" w:hAnsi="Cambria" w:cs="Cambria"/>
+                <w:bCs/>
+                <w:sz w:val="20"/>
+                <w:szCs w:val="20"/>
+              </w:rPr>
+            </w:pPr>
+          </w:p>
+        </w:tc>
+        <w:tc>
+          <w:tcPr>
+            <w:tcW w:w="931" w:type="dxa"/>
           </w:tcPr>
           <w:p>
             <w:pPr>
@@ -2371,28 +2607,38 @@
           </w:p>
           <w:p>
             <w:pPr>
-              <w:rPr>
-                <w:rFonts w:ascii="Cambria" w:eastAsia="Cambria" w:hAnsi="Cambria" w:cs="Cambria"/>
-                <w:bCs/>
-                <w:sz w:val="20"/>
-                <w:szCs w:val="20"/>
-              </w:rPr>
-            </w:pPr>
-          </w:p>
-          <w:p>
-            <w:pPr>
-              <w:rPr>
-                <w:rFonts w:ascii="Cambria" w:eastAsia="Cambria" w:hAnsi="Cambria" w:cs="Cambria"/>
-                <w:bCs/>
-                <w:sz w:val="20"/>
-                <w:szCs w:val="20"/>
-              </w:rPr>
-            </w:pPr>
-          </w:p>
-        </w:tc>
-        <w:tc>
-          <w:tcPr>
-            <w:tcW w:w="864" w:type="dxa"/>
+              <w:jc w:val="center"/>
+              <w:rPr>
+                <w:rFonts w:ascii="Cambria" w:eastAsia="Cambria" w:hAnsi="Cambria" w:cs="Cambria"/>
+                <w:bCs/>
+                <w:sz w:val="20"/>
+                <w:szCs w:val="20"/>
+              </w:rPr>
+            </w:pPr>
+            <w:r>
+              <w:t>{ws_1</w:t>
+            </w:r>
+            <w:r>
+              <w:t>4</w:t>
+            </w:r>
+            <w:r>
+              <w:t>}</w:t>
+            </w:r>
+          </w:p>
+          <w:p>
+            <w:pPr>
+              <w:rPr>
+                <w:rFonts w:ascii="Cambria" w:eastAsia="Cambria" w:hAnsi="Cambria" w:cs="Cambria"/>
+                <w:bCs/>
+                <w:sz w:val="20"/>
+                <w:szCs w:val="20"/>
+              </w:rPr>
+            </w:pPr>
+          </w:p>
+        </w:tc>
+        <w:tc>
+          <w:tcPr>
+            <w:tcW w:w="931" w:type="dxa"/>
           </w:tcPr>
           <w:p>
             <w:pPr>
@@ -2415,28 +2661,38 @@
           </w:p>
           <w:p>
             <w:pPr>
-              <w:rPr>
-                <w:rFonts w:ascii="Cambria" w:eastAsia="Cambria" w:hAnsi="Cambria" w:cs="Cambria"/>
-                <w:bCs/>
-                <w:sz w:val="20"/>
-                <w:szCs w:val="20"/>
-              </w:rPr>
-            </w:pPr>
-          </w:p>
-          <w:p>
-            <w:pPr>
-              <w:rPr>
-                <w:rFonts w:ascii="Cambria" w:eastAsia="Cambria" w:hAnsi="Cambria" w:cs="Cambria"/>
-                <w:bCs/>
-                <w:sz w:val="20"/>
-                <w:szCs w:val="20"/>
-              </w:rPr>
-            </w:pPr>
-          </w:p>
-        </w:tc>
-        <w:tc>
-          <w:tcPr>
-            <w:tcW w:w="864" w:type="dxa"/>
+              <w:jc w:val="center"/>
+              <w:rPr>
+                <w:rFonts w:ascii="Cambria" w:eastAsia="Cambria" w:hAnsi="Cambria" w:cs="Cambria"/>
+                <w:bCs/>
+                <w:sz w:val="20"/>
+                <w:szCs w:val="20"/>
+              </w:rPr>
+            </w:pPr>
+            <w:r>
+              <w:t>{ws_1</w:t>
+            </w:r>
+            <w:r>
+              <w:t>5</w:t>
+            </w:r>
+            <w:r>
+              <w:t>}</w:t>
+            </w:r>
+          </w:p>
+          <w:p>
+            <w:pPr>
+              <w:rPr>
+                <w:rFonts w:ascii="Cambria" w:eastAsia="Cambria" w:hAnsi="Cambria" w:cs="Cambria"/>
+                <w:bCs/>
+                <w:sz w:val="20"/>
+                <w:szCs w:val="20"/>
+              </w:rPr>
+            </w:pPr>
+          </w:p>
+        </w:tc>
+        <w:tc>
+          <w:tcPr>
+            <w:tcW w:w="931" w:type="dxa"/>
           </w:tcPr>
           <w:p>
             <w:pPr>
@@ -2459,13 +2715,23 @@
           </w:p>
           <w:p>
             <w:pPr>
-              <w:rPr>
-                <w:rFonts w:ascii="Cambria" w:eastAsia="Cambria" w:hAnsi="Cambria" w:cs="Cambria"/>
-                <w:bCs/>
-                <w:sz w:val="20"/>
-                <w:szCs w:val="20"/>
-              </w:rPr>
-            </w:pPr>
+              <w:jc w:val="center"/>
+              <w:rPr>
+                <w:rFonts w:ascii="Cambria" w:eastAsia="Cambria" w:hAnsi="Cambria" w:cs="Cambria"/>
+                <w:bCs/>
+                <w:sz w:val="20"/>
+                <w:szCs w:val="20"/>
+              </w:rPr>
+            </w:pPr>
+            <w:r>
+              <w:t>{ws_1</w:t>
+            </w:r>
+            <w:r>
+              <w:t>6</w:t>
+            </w:r>
+            <w:r>
+              <w:t>}</w:t>
+            </w:r>
           </w:p>
           <w:p>
             <w:pPr>
@@ -2486,7 +2752,7 @@
         </w:trPr>
         <w:tc>
           <w:tcPr>
-            <w:tcW w:w="864" w:type="dxa"/>
+            <w:tcW w:w="931" w:type="dxa"/>
           </w:tcPr>
           <w:p>
             <w:pPr>
@@ -2505,6 +2771,85 @@
                 <w:szCs w:val="20"/>
               </w:rPr>
               <w:t>1</w:t>
+            </w:r>
+          </w:p>
+          <w:p>
+            <w:pPr>
+              <w:jc w:val="center"/>
+              <w:rPr>
+                <w:rFonts w:ascii="Cambria" w:eastAsia="Cambria" w:hAnsi="Cambria" w:cs="Cambria"/>
+                <w:bCs/>
+                <w:sz w:val="20"/>
+                <w:szCs w:val="20"/>
+              </w:rPr>
+            </w:pPr>
+            <w:r>
+              <w:t>{ws_1}</w:t>
+            </w:r>
+          </w:p>
+        </w:tc>
+        <w:tc>
+          <w:tcPr>
+            <w:tcW w:w="931" w:type="dxa"/>
+          </w:tcPr>
+          <w:p>
+            <w:pPr>
+              <w:rPr>
+                <w:rFonts w:ascii="Cambria" w:eastAsia="Cambria" w:hAnsi="Cambria" w:cs="Cambria"/>
+                <w:bCs/>
+                <w:sz w:val="20"/>
+                <w:szCs w:val="20"/>
+              </w:rPr>
+            </w:pPr>
+            <w:r>
+              <w:rPr>
+                <w:rFonts w:ascii="Cambria" w:eastAsia="Cambria" w:hAnsi="Cambria" w:cs="Cambria"/>
+                <w:bCs/>
+                <w:sz w:val="20"/>
+                <w:szCs w:val="20"/>
+              </w:rPr>
+              <w:t>2</w:t>
+            </w:r>
+          </w:p>
+          <w:p>
+            <w:pPr>
+              <w:jc w:val="center"/>
+              <w:rPr>
+                <w:rFonts w:ascii="Cambria" w:eastAsia="Cambria" w:hAnsi="Cambria" w:cs="Cambria"/>
+                <w:bCs/>
+                <w:sz w:val="20"/>
+                <w:szCs w:val="20"/>
+              </w:rPr>
+            </w:pPr>
+            <w:r>
+              <w:t>{ws_2</w:t>
+            </w:r>
+            <w:r>
+              <w:t>}</w:t>
+            </w:r>
+          </w:p>
+        </w:tc>
+        <w:tc>
+          <w:tcPr>
+            <w:tcW w:w="931" w:type="dxa"/>
+          </w:tcPr>
+          <w:p>
+            <w:pPr>
+              <w:rPr>
+                <w:rFonts w:ascii="Cambria" w:eastAsia="Cambria" w:hAnsi="Cambria" w:cs="Cambria"/>
+                <w:bCs/>
+                <w:sz w:val="20"/>
+                <w:szCs w:val="20"/>
+              </w:rPr>
+            </w:pPr>
+            <w:r>
+              <w:rPr>
+                <w:rFonts w:ascii="Cambria" w:eastAsia="Cambria" w:hAnsi="Cambria" w:cs="Cambria"/>
+                <w:bCs/>
+                <w:sz w:val="20"/>
+                <w:szCs w:val="20"/>
+              </w:rPr>
+              <w:t>3</w:t>
             </w:r>
           </w:p>
           <w:p>
@@ -2517,6 +2862,12 @@
                 <w:szCs w:val="28"/>
               </w:rPr>
             </w:pPr>
+            <w:r>
+              <w:t>{ws_3</w:t>
+            </w:r>
+            <w:r>
+              <w:t>}</w:t>
+            </w:r>
           </w:p>
           <w:p>
             <w:pPr>
@@ -2532,25 +2883,26 @@
         </w:tc>
         <w:tc>
           <w:tcPr>
-            <w:tcW w:w="864" w:type="dxa"/>
-          </w:tcPr>
-          <w:p>
-            <w:pPr>
-              <w:rPr>
-                <w:rFonts w:ascii="Cambria" w:eastAsia="Cambria" w:hAnsi="Cambria" w:cs="Cambria"/>
-                <w:bCs/>
-                <w:sz w:val="20"/>
-                <w:szCs w:val="20"/>
-              </w:rPr>
-            </w:pPr>
-            <w:r>
-              <w:rPr>
-                <w:rFonts w:ascii="Cambria" w:eastAsia="Cambria" w:hAnsi="Cambria" w:cs="Cambria"/>
-                <w:bCs/>
-                <w:sz w:val="20"/>
-                <w:szCs w:val="20"/>
-              </w:rPr>
-              <w:t>2</w:t>
+            <w:tcW w:w="931" w:type="dxa"/>
+          </w:tcPr>
+          <w:p>
+            <w:pPr>
+              <w:jc w:val="both"/>
+              <w:rPr>
+                <w:rFonts w:ascii="Cambria" w:eastAsia="Cambria" w:hAnsi="Cambria" w:cs="Cambria"/>
+                <w:bCs/>
+                <w:sz w:val="20"/>
+                <w:szCs w:val="20"/>
+              </w:rPr>
+            </w:pPr>
+            <w:r>
+              <w:rPr>
+                <w:rFonts w:ascii="Cambria" w:eastAsia="Cambria" w:hAnsi="Cambria" w:cs="Cambria"/>
+                <w:bCs/>
+                <w:sz w:val="20"/>
+                <w:szCs w:val="20"/>
+              </w:rPr>
+              <w:t>4</w:t>
             </w:r>
           </w:p>
           <w:p>
@@ -2563,87 +2915,12 @@
                 <w:szCs w:val="20"/>
               </w:rPr>
             </w:pPr>
-          </w:p>
-        </w:tc>
-        <w:tc>
-          <w:tcPr>
-            <w:tcW w:w="864" w:type="dxa"/>
-          </w:tcPr>
-          <w:p>
-            <w:pPr>
-              <w:rPr>
-                <w:rFonts w:ascii="Cambria" w:eastAsia="Cambria" w:hAnsi="Cambria" w:cs="Cambria"/>
-                <w:bCs/>
-                <w:sz w:val="20"/>
-                <w:szCs w:val="20"/>
-              </w:rPr>
-            </w:pPr>
-            <w:r>
-              <w:rPr>
-                <w:rFonts w:ascii="Cambria" w:eastAsia="Cambria" w:hAnsi="Cambria" w:cs="Cambria"/>
-                <w:bCs/>
-                <w:sz w:val="20"/>
-                <w:szCs w:val="20"/>
-              </w:rPr>
-              <w:t>3</w:t>
-            </w:r>
-          </w:p>
-          <w:p>
-            <w:pPr>
-              <w:jc w:val="center"/>
-              <w:rPr>
-                <w:rFonts w:ascii="Cambria" w:eastAsia="Cambria" w:hAnsi="Cambria" w:cs="Cambria"/>
-                <w:bCs/>
-                <w:sz w:val="28"/>
-                <w:szCs w:val="28"/>
-              </w:rPr>
-            </w:pPr>
-          </w:p>
-          <w:p>
-            <w:pPr>
-              <w:jc w:val="center"/>
-              <w:rPr>
-                <w:rFonts w:ascii="Cambria" w:eastAsia="Cambria" w:hAnsi="Cambria" w:cs="Cambria"/>
-                <w:bCs/>
-                <w:sz w:val="20"/>
-                <w:szCs w:val="20"/>
-              </w:rPr>
-            </w:pPr>
-          </w:p>
-        </w:tc>
-        <w:tc>
-          <w:tcPr>
-            <w:tcW w:w="864" w:type="dxa"/>
-          </w:tcPr>
-          <w:p>
-            <w:pPr>
-              <w:jc w:val="both"/>
-              <w:rPr>
-                <w:rFonts w:ascii="Cambria" w:eastAsia="Cambria" w:hAnsi="Cambria" w:cs="Cambria"/>
-                <w:bCs/>
-                <w:sz w:val="20"/>
-                <w:szCs w:val="20"/>
-              </w:rPr>
-            </w:pPr>
-            <w:r>
-              <w:rPr>
-                <w:rFonts w:ascii="Cambria" w:eastAsia="Cambria" w:hAnsi="Cambria" w:cs="Cambria"/>
-                <w:bCs/>
-                <w:sz w:val="20"/>
-                <w:szCs w:val="20"/>
-              </w:rPr>
-              <w:t>4</w:t>
-            </w:r>
-          </w:p>
-          <w:p>
-            <w:pPr>
-              <w:rPr>
-                <w:rFonts w:ascii="Cambria" w:eastAsia="Cambria" w:hAnsi="Cambria" w:cs="Cambria"/>
-                <w:bCs/>
-                <w:sz w:val="20"/>
-                <w:szCs w:val="20"/>
-              </w:rPr>
-            </w:pPr>
+            <w:r>
+              <w:t>{ws_4</w:t>
+            </w:r>
+            <w:r>
+              <w:t>}</w:t>
+            </w:r>
           </w:p>
           <w:p>
             <w:pPr>
@@ -2677,7 +2954,7 @@
         </w:tc>
         <w:tc>
           <w:tcPr>
-            <w:tcW w:w="864" w:type="dxa"/>
+            <w:tcW w:w="931" w:type="dxa"/>
           </w:tcPr>
           <w:p>
             <w:pPr>
@@ -2700,28 +2977,38 @@
           </w:p>
           <w:p>
             <w:pPr>
-              <w:rPr>
-                <w:rFonts w:ascii="Cambria" w:eastAsia="Cambria" w:hAnsi="Cambria" w:cs="Cambria"/>
-                <w:bCs/>
-                <w:sz w:val="20"/>
-                <w:szCs w:val="20"/>
-              </w:rPr>
-            </w:pPr>
-          </w:p>
-          <w:p>
-            <w:pPr>
-              <w:rPr>
-                <w:rFonts w:ascii="Cambria" w:eastAsia="Cambria" w:hAnsi="Cambria" w:cs="Cambria"/>
-                <w:bCs/>
-                <w:sz w:val="20"/>
-                <w:szCs w:val="20"/>
-              </w:rPr>
-            </w:pPr>
-          </w:p>
-        </w:tc>
-        <w:tc>
-          <w:tcPr>
-            <w:tcW w:w="864" w:type="dxa"/>
+              <w:jc w:val="center"/>
+              <w:rPr>
+                <w:rFonts w:ascii="Cambria" w:eastAsia="Cambria" w:hAnsi="Cambria" w:cs="Cambria"/>
+                <w:bCs/>
+                <w:sz w:val="20"/>
+                <w:szCs w:val="20"/>
+              </w:rPr>
+            </w:pPr>
+            <w:r>
+              <w:t>{ws_</w:t>
+            </w:r>
+            <w:r>
+              <w:t>5</w:t>
+            </w:r>
+            <w:r>
+              <w:t>}</w:t>
+            </w:r>
+          </w:p>
+          <w:p>
+            <w:pPr>
+              <w:rPr>
+                <w:rFonts w:ascii="Cambria" w:eastAsia="Cambria" w:hAnsi="Cambria" w:cs="Cambria"/>
+                <w:bCs/>
+                <w:sz w:val="20"/>
+                <w:szCs w:val="20"/>
+              </w:rPr>
+            </w:pPr>
+          </w:p>
+        </w:tc>
+        <w:tc>
+          <w:tcPr>
+            <w:tcW w:w="931" w:type="dxa"/>
           </w:tcPr>
           <w:p>
             <w:pPr>
@@ -2744,28 +3031,38 @@
           </w:p>
           <w:p>
             <w:pPr>
-              <w:rPr>
-                <w:rFonts w:ascii="Cambria" w:eastAsia="Cambria" w:hAnsi="Cambria" w:cs="Cambria"/>
-                <w:bCs/>
-                <w:sz w:val="20"/>
-                <w:szCs w:val="20"/>
-              </w:rPr>
-            </w:pPr>
-          </w:p>
-          <w:p>
-            <w:pPr>
-              <w:rPr>
-                <w:rFonts w:ascii="Cambria" w:eastAsia="Cambria" w:hAnsi="Cambria" w:cs="Cambria"/>
-                <w:bCs/>
-                <w:sz w:val="20"/>
-                <w:szCs w:val="20"/>
-              </w:rPr>
-            </w:pPr>
-          </w:p>
-        </w:tc>
-        <w:tc>
-          <w:tcPr>
-            <w:tcW w:w="864" w:type="dxa"/>
+              <w:jc w:val="center"/>
+              <w:rPr>
+                <w:rFonts w:ascii="Cambria" w:eastAsia="Cambria" w:hAnsi="Cambria" w:cs="Cambria"/>
+                <w:bCs/>
+                <w:sz w:val="20"/>
+                <w:szCs w:val="20"/>
+              </w:rPr>
+            </w:pPr>
+            <w:r>
+              <w:t>{ws_</w:t>
+            </w:r>
+            <w:r>
+              <w:t>6</w:t>
+            </w:r>
+            <w:r>
+              <w:t>}</w:t>
+            </w:r>
+          </w:p>
+          <w:p>
+            <w:pPr>
+              <w:rPr>
+                <w:rFonts w:ascii="Cambria" w:eastAsia="Cambria" w:hAnsi="Cambria" w:cs="Cambria"/>
+                <w:bCs/>
+                <w:sz w:val="20"/>
+                <w:szCs w:val="20"/>
+              </w:rPr>
+            </w:pPr>
+          </w:p>
+        </w:tc>
+        <w:tc>
+          <w:tcPr>
+            <w:tcW w:w="931" w:type="dxa"/>
           </w:tcPr>
           <w:p>
             <w:pPr>
@@ -2788,28 +3085,38 @@
           </w:p>
           <w:p>
             <w:pPr>
-              <w:rPr>
-                <w:rFonts w:ascii="Cambria" w:eastAsia="Cambria" w:hAnsi="Cambria" w:cs="Cambria"/>
-                <w:bCs/>
-                <w:sz w:val="20"/>
-                <w:szCs w:val="20"/>
-              </w:rPr>
-            </w:pPr>
-          </w:p>
-          <w:p>
-            <w:pPr>
-              <w:rPr>
-                <w:rFonts w:ascii="Cambria" w:eastAsia="Cambria" w:hAnsi="Cambria" w:cs="Cambria"/>
-                <w:bCs/>
-                <w:sz w:val="20"/>
-                <w:szCs w:val="20"/>
-              </w:rPr>
-            </w:pPr>
-          </w:p>
-        </w:tc>
-        <w:tc>
-          <w:tcPr>
-            <w:tcW w:w="864" w:type="dxa"/>
+              <w:jc w:val="center"/>
+              <w:rPr>
+                <w:rFonts w:ascii="Cambria" w:eastAsia="Cambria" w:hAnsi="Cambria" w:cs="Cambria"/>
+                <w:bCs/>
+                <w:sz w:val="20"/>
+                <w:szCs w:val="20"/>
+              </w:rPr>
+            </w:pPr>
+            <w:r>
+              <w:t>{ws_</w:t>
+            </w:r>
+            <w:r>
+              <w:t>7</w:t>
+            </w:r>
+            <w:r>
+              <w:t>}</w:t>
+            </w:r>
+          </w:p>
+          <w:p>
+            <w:pPr>
+              <w:rPr>
+                <w:rFonts w:ascii="Cambria" w:eastAsia="Cambria" w:hAnsi="Cambria" w:cs="Cambria"/>
+                <w:bCs/>
+                <w:sz w:val="20"/>
+                <w:szCs w:val="20"/>
+              </w:rPr>
+            </w:pPr>
+          </w:p>
+        </w:tc>
+        <w:tc>
+          <w:tcPr>
+            <w:tcW w:w="931" w:type="dxa"/>
           </w:tcPr>
           <w:p>
             <w:pPr>
@@ -2832,13 +3139,23 @@
           </w:p>
           <w:p>
             <w:pPr>
-              <w:rPr>
-                <w:rFonts w:ascii="Cambria" w:eastAsia="Cambria" w:hAnsi="Cambria" w:cs="Cambria"/>
-                <w:bCs/>
-                <w:sz w:val="20"/>
-                <w:szCs w:val="20"/>
-              </w:rPr>
-            </w:pPr>
+              <w:jc w:val="center"/>
+              <w:rPr>
+                <w:rFonts w:ascii="Cambria" w:eastAsia="Cambria" w:hAnsi="Cambria" w:cs="Cambria"/>
+                <w:bCs/>
+                <w:sz w:val="20"/>
+                <w:szCs w:val="20"/>
+              </w:rPr>
+            </w:pPr>
+            <w:r>
+              <w:t>{ws_</w:t>
+            </w:r>
+            <w:r>
+              <w:t>8</w:t>
+            </w:r>
+            <w:r>
+              <w:t>}</w:t>
+            </w:r>
           </w:p>
           <w:p>
             <w:pPr>
@@ -3230,8 +3547,6 @@
             </w:r>
           </w:p>
         </w:tc>
-        <w:bookmarkStart w:id="0" w:name="_GoBack"/>
-        <w:bookmarkEnd w:id="0"/>
       </w:tr>
     </w:tbl>
     <w:p>

</xml_diff>

<commit_message>
Added auto generation for dar with templates, removed approved by in software forms, removed console logs, added refresh periodically every 30 min. fix software form download template
</commit_message>
<xml_diff>
--- a/frontend/public/Lab1_DAR.docx
+++ b/frontend/public/Lab1_DAR.docx
@@ -1011,10 +1011,7 @@
               </w:rPr>
             </w:pPr>
             <w:r>
-              <w:t>{ws_33</w:t>
-            </w:r>
-            <w:r>
-              <w:t>}</w:t>
+              <w:t>{ws_33}</w:t>
             </w:r>
           </w:p>
           <w:p>
@@ -1062,10 +1059,7 @@
               </w:rPr>
             </w:pPr>
             <w:r>
-              <w:t>{ws_34</w:t>
-            </w:r>
-            <w:r>
-              <w:t>}</w:t>
+              <w:t>{ws_34}</w:t>
             </w:r>
           </w:p>
           <w:p>
@@ -1113,10 +1107,7 @@
               </w:rPr>
             </w:pPr>
             <w:r>
-              <w:t>{ws_35</w:t>
-            </w:r>
-            <w:r>
-              <w:t>}</w:t>
+              <w:t>{ws_35}</w:t>
             </w:r>
           </w:p>
           <w:p>
@@ -1164,10 +1155,7 @@
               </w:rPr>
             </w:pPr>
             <w:r>
-              <w:t>{ws_36</w:t>
-            </w:r>
-            <w:r>
-              <w:t>}</w:t>
+              <w:t>{ws_36}</w:t>
             </w:r>
           </w:p>
           <w:p>
@@ -1234,10 +1222,7 @@
               </w:rPr>
             </w:pPr>
             <w:r>
-              <w:t>{ws_37</w:t>
-            </w:r>
-            <w:r>
-              <w:t>}</w:t>
+              <w:t>{ws_37}</w:t>
             </w:r>
           </w:p>
           <w:p>
@@ -1285,10 +1270,7 @@
               </w:rPr>
             </w:pPr>
             <w:r>
-              <w:t>{ws_38</w:t>
-            </w:r>
-            <w:r>
-              <w:t>}</w:t>
+              <w:t>{ws_38}</w:t>
             </w:r>
           </w:p>
           <w:p>
@@ -1336,10 +1318,7 @@
               </w:rPr>
             </w:pPr>
             <w:r>
-              <w:t>{ws_39</w:t>
-            </w:r>
-            <w:r>
-              <w:t>}</w:t>
+              <w:t>{ws_39}</w:t>
             </w:r>
           </w:p>
           <w:p>
@@ -1387,10 +1366,7 @@
               </w:rPr>
             </w:pPr>
             <w:r>
-              <w:t>{ws_40</w:t>
-            </w:r>
-            <w:r>
-              <w:t>}</w:t>
+              <w:t>{ws_40}</w:t>
             </w:r>
           </w:p>
           <w:p>
@@ -1444,10 +1420,7 @@
               </w:rPr>
             </w:pPr>
             <w:r>
-              <w:t>{ws_25</w:t>
-            </w:r>
-            <w:r>
-              <w:t>}</w:t>
+              <w:t>{ws_25}</w:t>
             </w:r>
           </w:p>
           <w:p>
@@ -1495,10 +1468,7 @@
               </w:rPr>
             </w:pPr>
             <w:r>
-              <w:t>{ws_26</w:t>
-            </w:r>
-            <w:r>
-              <w:t>}</w:t>
+              <w:t>{ws_26}</w:t>
             </w:r>
           </w:p>
           <w:p>
@@ -1546,10 +1516,7 @@
               </w:rPr>
             </w:pPr>
             <w:r>
-              <w:t>{ws_27</w:t>
-            </w:r>
-            <w:r>
-              <w:t>}</w:t>
+              <w:t>{ws_27}</w:t>
             </w:r>
           </w:p>
           <w:p>
@@ -1597,10 +1564,7 @@
               </w:rPr>
             </w:pPr>
             <w:r>
-              <w:t>{ws_28</w:t>
-            </w:r>
-            <w:r>
-              <w:t>}</w:t>
+              <w:t>{ws_28}</w:t>
             </w:r>
           </w:p>
           <w:p>
@@ -1667,10 +1631,7 @@
               </w:rPr>
             </w:pPr>
             <w:r>
-              <w:t>{ws_29</w:t>
-            </w:r>
-            <w:r>
-              <w:t>}</w:t>
+              <w:t>{ws_29}</w:t>
             </w:r>
           </w:p>
           <w:p>
@@ -1718,10 +1679,7 @@
               </w:rPr>
             </w:pPr>
             <w:r>
-              <w:t>{ws_30</w:t>
-            </w:r>
-            <w:r>
-              <w:t>}</w:t>
+              <w:t>{ws_30}</w:t>
             </w:r>
           </w:p>
           <w:p>
@@ -1769,13 +1727,7 @@
               </w:rPr>
             </w:pPr>
             <w:r>
-              <w:t>{ws_</w:t>
-            </w:r>
-            <w:r>
-              <w:t>3</w:t>
-            </w:r>
-            <w:r>
-              <w:t>1}</w:t>
+              <w:t>{ws_31}</w:t>
             </w:r>
           </w:p>
           <w:p>
@@ -1823,10 +1775,7 @@
               </w:rPr>
             </w:pPr>
             <w:r>
-              <w:t>{ws_32</w:t>
-            </w:r>
-            <w:r>
-              <w:t>}</w:t>
+              <w:t>{ws_32}</w:t>
             </w:r>
           </w:p>
           <w:p>
@@ -1880,13 +1829,7 @@
               </w:rPr>
             </w:pPr>
             <w:r>
-              <w:t>{ws_1</w:t>
-            </w:r>
-            <w:r>
-              <w:t>7</w:t>
-            </w:r>
-            <w:r>
-              <w:t>}</w:t>
+              <w:t>{ws_17}</w:t>
             </w:r>
           </w:p>
           <w:p>
@@ -1934,13 +1877,7 @@
               </w:rPr>
             </w:pPr>
             <w:r>
-              <w:t>{ws_1</w:t>
-            </w:r>
-            <w:r>
-              <w:t>8</w:t>
-            </w:r>
-            <w:r>
-              <w:t>}</w:t>
+              <w:t>{ws_18}</w:t>
             </w:r>
           </w:p>
           <w:p>
@@ -1988,13 +1925,7 @@
               </w:rPr>
             </w:pPr>
             <w:r>
-              <w:t>{ws_1</w:t>
-            </w:r>
-            <w:r>
-              <w:t>9</w:t>
-            </w:r>
-            <w:r>
-              <w:t>}</w:t>
+              <w:t>{ws_19}</w:t>
             </w:r>
           </w:p>
           <w:p>
@@ -2042,10 +1973,7 @@
               </w:rPr>
             </w:pPr>
             <w:r>
-              <w:t>{ws_20</w:t>
-            </w:r>
-            <w:r>
-              <w:t>}</w:t>
+              <w:t>{ws_20}</w:t>
             </w:r>
           </w:p>
           <w:p>
@@ -2112,13 +2040,7 @@
               </w:rPr>
             </w:pPr>
             <w:r>
-              <w:t>{ws_</w:t>
-            </w:r>
-            <w:r>
-              <w:t>2</w:t>
-            </w:r>
-            <w:r>
-              <w:t>1}</w:t>
+              <w:t>{ws_21}</w:t>
             </w:r>
           </w:p>
           <w:p>
@@ -2166,10 +2088,7 @@
               </w:rPr>
             </w:pPr>
             <w:r>
-              <w:t>{ws_22</w:t>
-            </w:r>
-            <w:r>
-              <w:t>}</w:t>
+              <w:t>{ws_22}</w:t>
             </w:r>
           </w:p>
           <w:p>
@@ -2217,10 +2136,7 @@
               </w:rPr>
             </w:pPr>
             <w:r>
-              <w:t>{ws_23</w:t>
-            </w:r>
-            <w:r>
-              <w:t>}</w:t>
+              <w:t>{ws_23}</w:t>
             </w:r>
           </w:p>
           <w:p>
@@ -2268,25 +2184,20 @@
               </w:rPr>
             </w:pPr>
             <w:r>
-              <w:t>{ws_24</w:t>
-            </w:r>
-            <w:r>
-              <w:t>}</w:t>
-            </w:r>
-          </w:p>
-          <w:p>
-            <w:pPr>
-              <w:rPr>
-                <w:rFonts w:ascii="Cambria" w:eastAsia="Cambria" w:hAnsi="Cambria" w:cs="Cambria"/>
-                <w:bCs/>
-                <w:sz w:val="20"/>
-                <w:szCs w:val="20"/>
-              </w:rPr>
-            </w:pPr>
-          </w:p>
-        </w:tc>
-        <w:bookmarkStart w:id="0" w:name="_GoBack"/>
-        <w:bookmarkEnd w:id="0"/>
+              <w:t>{ws_24}</w:t>
+            </w:r>
+          </w:p>
+          <w:p>
+            <w:pPr>
+              <w:rPr>
+                <w:rFonts w:ascii="Cambria" w:eastAsia="Cambria" w:hAnsi="Cambria" w:cs="Cambria"/>
+                <w:bCs/>
+                <w:sz w:val="20"/>
+                <w:szCs w:val="20"/>
+              </w:rPr>
+            </w:pPr>
+          </w:p>
+        </w:tc>
       </w:tr>
       <w:tr>
         <w:trPr>
@@ -2327,13 +2238,7 @@
               </w:rPr>
             </w:pPr>
             <w:r>
-              <w:t>{ws_</w:t>
-            </w:r>
-            <w:r>
-              <w:t>9</w:t>
-            </w:r>
-            <w:r>
-              <w:t>}</w:t>
+              <w:t>{ws_9}</w:t>
             </w:r>
           </w:p>
           <w:p>
@@ -2381,13 +2286,7 @@
               </w:rPr>
             </w:pPr>
             <w:r>
-              <w:t>{ws_1</w:t>
-            </w:r>
-            <w:r>
-              <w:t>0</w:t>
-            </w:r>
-            <w:r>
-              <w:t>}</w:t>
+              <w:t>{ws_10}</w:t>
             </w:r>
           </w:p>
           <w:p>
@@ -2435,13 +2334,7 @@
               </w:rPr>
             </w:pPr>
             <w:r>
-              <w:t>{ws_</w:t>
-            </w:r>
-            <w:r>
-              <w:t>11</w:t>
-            </w:r>
-            <w:r>
-              <w:t>}</w:t>
+              <w:t>{ws_11}</w:t>
             </w:r>
           </w:p>
           <w:p>
@@ -2489,13 +2382,7 @@
               </w:rPr>
             </w:pPr>
             <w:r>
-              <w:t>{ws_1</w:t>
-            </w:r>
-            <w:r>
-              <w:t>2</w:t>
-            </w:r>
-            <w:r>
-              <w:t>}</w:t>
+              <w:t>{ws_12}</w:t>
             </w:r>
           </w:p>
           <w:p>
@@ -2562,13 +2449,7 @@
               </w:rPr>
             </w:pPr>
             <w:r>
-              <w:t>{ws_1</w:t>
-            </w:r>
-            <w:r>
-              <w:t>3</w:t>
-            </w:r>
-            <w:r>
-              <w:t>}</w:t>
+              <w:t>{ws_13}</w:t>
             </w:r>
           </w:p>
           <w:p>
@@ -2616,13 +2497,7 @@
               </w:rPr>
             </w:pPr>
             <w:r>
-              <w:t>{ws_1</w:t>
-            </w:r>
-            <w:r>
-              <w:t>4</w:t>
-            </w:r>
-            <w:r>
-              <w:t>}</w:t>
+              <w:t>{ws_14}</w:t>
             </w:r>
           </w:p>
           <w:p>
@@ -2670,13 +2545,7 @@
               </w:rPr>
             </w:pPr>
             <w:r>
-              <w:t>{ws_1</w:t>
-            </w:r>
-            <w:r>
-              <w:t>5</w:t>
-            </w:r>
-            <w:r>
-              <w:t>}</w:t>
+              <w:t>{ws_15}</w:t>
             </w:r>
           </w:p>
           <w:p>
@@ -2724,13 +2593,7 @@
               </w:rPr>
             </w:pPr>
             <w:r>
-              <w:t>{ws_1</w:t>
-            </w:r>
-            <w:r>
-              <w:t>6</w:t>
-            </w:r>
-            <w:r>
-              <w:t>}</w:t>
+              <w:t>{ws_16}</w:t>
             </w:r>
           </w:p>
           <w:p>
@@ -2822,10 +2685,7 @@
               </w:rPr>
             </w:pPr>
             <w:r>
-              <w:t>{ws_2</w:t>
-            </w:r>
-            <w:r>
-              <w:t>}</w:t>
+              <w:t>{ws_2}</w:t>
             </w:r>
           </w:p>
         </w:tc>
@@ -2863,10 +2723,7 @@
               </w:rPr>
             </w:pPr>
             <w:r>
-              <w:t>{ws_3</w:t>
-            </w:r>
-            <w:r>
-              <w:t>}</w:t>
+              <w:t>{ws_3}</w:t>
             </w:r>
           </w:p>
           <w:p>
@@ -2916,10 +2773,7 @@
               </w:rPr>
             </w:pPr>
             <w:r>
-              <w:t>{ws_4</w:t>
-            </w:r>
-            <w:r>
-              <w:t>}</w:t>
+              <w:t>{ws_4}</w:t>
             </w:r>
           </w:p>
           <w:p>
@@ -2986,13 +2840,7 @@
               </w:rPr>
             </w:pPr>
             <w:r>
-              <w:t>{ws_</w:t>
-            </w:r>
-            <w:r>
-              <w:t>5</w:t>
-            </w:r>
-            <w:r>
-              <w:t>}</w:t>
+              <w:t>{ws_5}</w:t>
             </w:r>
           </w:p>
           <w:p>
@@ -3040,13 +2888,7 @@
               </w:rPr>
             </w:pPr>
             <w:r>
-              <w:t>{ws_</w:t>
-            </w:r>
-            <w:r>
-              <w:t>6</w:t>
-            </w:r>
-            <w:r>
-              <w:t>}</w:t>
+              <w:t>{ws_6}</w:t>
             </w:r>
           </w:p>
           <w:p>
@@ -3094,13 +2936,7 @@
               </w:rPr>
             </w:pPr>
             <w:r>
-              <w:t>{ws_</w:t>
-            </w:r>
-            <w:r>
-              <w:t>7</w:t>
-            </w:r>
-            <w:r>
-              <w:t>}</w:t>
+              <w:t>{ws_7}</w:t>
             </w:r>
           </w:p>
           <w:p>
@@ -3148,13 +2984,7 @@
               </w:rPr>
             </w:pPr>
             <w:r>
-              <w:t>{ws_</w:t>
-            </w:r>
-            <w:r>
-              <w:t>8</w:t>
-            </w:r>
-            <w:r>
-              <w:t>}</w:t>
+              <w:t>{ws_8}</w:t>
             </w:r>
           </w:p>
           <w:p>
@@ -3185,7 +3015,8 @@
         <w:spacing w:after="0" w:line="240" w:lineRule="auto"/>
         <w:rPr>
           <w:rFonts w:ascii="Cambria" w:eastAsia="Cambria" w:hAnsi="Cambria" w:cs="Cambria"/>
-          <w:u w:val="single"/>
+          <w:b/>
+          <w:bCs/>
         </w:rPr>
       </w:pPr>
       <w:r>
@@ -3196,12 +3027,17 @@
         </w:rPr>
         <w:t>Remarks:</w:t>
       </w:r>
-      <w:r>
+    </w:p>
+    <w:p>
+      <w:pPr>
+        <w:spacing w:after="0" w:line="240" w:lineRule="auto"/>
         <w:rPr>
           <w:rFonts w:ascii="Cambria" w:eastAsia="Cambria" w:hAnsi="Cambria" w:cs="Cambria"/>
+          <w:u w:val="single"/>
         </w:rPr>
-        <w:t xml:space="preserve"> </w:t>
-      </w:r>
+      </w:pPr>
+      <w:bookmarkStart w:id="0" w:name="_GoBack"/>
+      <w:bookmarkEnd w:id="0"/>
       <w:r>
         <w:rPr>
           <w:rFonts w:ascii="Cambria" w:eastAsia="Cambria" w:hAnsi="Cambria" w:cs="Cambria"/>
@@ -3423,6 +3259,7 @@
                 <w:b/>
                 <w:u w:val="single"/>
               </w:rPr>
+              <w:lastRenderedPageBreak/>
               <w:t>MR.</w:t>
             </w:r>
             <w:r>
@@ -3511,7 +3348,6 @@
               <w:rPr>
                 <w:rFonts w:ascii="Cambria" w:eastAsia="Cambria" w:hAnsi="Cambria" w:cs="Cambria"/>
               </w:rPr>
-              <w:lastRenderedPageBreak/>
               <w:t>Laboratory Custodian</w:t>
             </w:r>
           </w:p>
@@ -4233,6 +4069,7 @@
       <w:rPr>
         <w:noProof/>
         <w:color w:val="000000"/>
+        <w:lang w:val="en-PH" w:eastAsia="en-PH"/>
       </w:rPr>
       <w:drawing>
         <wp:inline distT="0" distB="0" distL="0" distR="0" wp14:anchorId="2BA53806" wp14:editId="7C62F8B2">

</xml_diff>